<commit_message>
One more October update. Bout to round off audit, then BIA, then the ISO & NIST capstones... Onwards.
</commit_message>
<xml_diff>
--- a/GRC Portfolio/SETA/SETA & Risk Management Review Embedded in Change Management.docx
+++ b/GRC Portfolio/SETA/SETA & Risk Management Review Embedded in Change Management.docx
@@ -245,6 +245,9 @@
       </w:pPr>
       <w:r>
         <w:lastRenderedPageBreak/>
+        <w:t xml:space="preserve">1. </w:t>
+      </w:r>
+      <w:r>
         <w:t>Purpose</w:t>
       </w:r>
       <w:r>
@@ -357,6 +360,9 @@
       </w:pPr>
       <w:r>
         <w:lastRenderedPageBreak/>
+        <w:t xml:space="preserve">2. </w:t>
+      </w:r>
+      <w:r>
         <w:t xml:space="preserve">Where </w:t>
       </w:r>
       <w:r>
@@ -901,6 +907,9 @@
       </w:pPr>
       <w:r>
         <w:lastRenderedPageBreak/>
+        <w:t xml:space="preserve">3. </w:t>
+      </w:r>
+      <w:r>
         <w:t>Tiering: What Counts as "Significant"</w:t>
       </w:r>
     </w:p>
@@ -1254,6 +1263,9 @@
       </w:pPr>
       <w:r>
         <w:lastRenderedPageBreak/>
+        <w:t xml:space="preserve">4. </w:t>
+      </w:r>
+      <w:r>
         <w:t>G0: SETA Impact Screen (complete at RFC intake)</w:t>
       </w:r>
     </w:p>
@@ -1993,8 +2005,16 @@
         <w:tabs>
           <w:tab w:val="left" w:pos="900"/>
         </w:tabs>
+        <w:rPr>
+          <w:b/>
+          <w:bCs/>
+        </w:rPr>
       </w:pPr>
       <w:r>
+        <w:rPr>
+          <w:b/>
+          <w:bCs/>
+        </w:rPr>
         <w:t>0 Yes = Tier 0–1</w:t>
       </w:r>
     </w:p>
@@ -2008,8 +2028,16 @@
         <w:tabs>
           <w:tab w:val="left" w:pos="900"/>
         </w:tabs>
+        <w:rPr>
+          <w:b/>
+          <w:bCs/>
+        </w:rPr>
       </w:pPr>
       <w:r>
+        <w:rPr>
+          <w:b/>
+          <w:bCs/>
+        </w:rPr>
         <w:t>1–3 Yes = Tier 2</w:t>
       </w:r>
     </w:p>
@@ -2023,18 +2051,32 @@
         <w:tabs>
           <w:tab w:val="left" w:pos="900"/>
         </w:tabs>
+        <w:rPr>
+          <w:b/>
+          <w:bCs/>
+        </w:rPr>
       </w:pPr>
       <w:r>
+        <w:rPr>
+          <w:b/>
+          <w:bCs/>
+        </w:rPr>
         <w:t xml:space="preserve">≥4 Yes, or any of Q5/Q6/Q11 with Q2 = Tier 3 (CAB may override </w:t>
       </w:r>
       <w:r>
         <w:rPr>
+          <w:b/>
+          <w:bCs/>
           <w:i/>
           <w:iCs/>
         </w:rPr>
         <w:t>upward</w:t>
       </w:r>
       <w:r>
+        <w:rPr>
+          <w:b/>
+          <w:bCs/>
+        </w:rPr>
         <w:t xml:space="preserve"> only).</w:t>
       </w:r>
     </w:p>
@@ -3454,7 +3496,7 @@
         <w:pStyle w:val="ListParagraph"/>
         <w:numPr>
           <w:ilvl w:val="0"/>
-          <w:numId w:val="49"/>
+          <w:numId w:val="50"/>
         </w:numPr>
         <w:tabs>
           <w:tab w:val="left" w:pos="900"/>
@@ -3477,7 +3519,7 @@
         <w:pStyle w:val="ListParagraph"/>
         <w:numPr>
           <w:ilvl w:val="0"/>
-          <w:numId w:val="49"/>
+          <w:numId w:val="50"/>
         </w:numPr>
         <w:tabs>
           <w:tab w:val="left" w:pos="900"/>
@@ -3503,7 +3545,7 @@
         <w:pStyle w:val="ListParagraph"/>
         <w:numPr>
           <w:ilvl w:val="0"/>
-          <w:numId w:val="49"/>
+          <w:numId w:val="50"/>
         </w:numPr>
         <w:tabs>
           <w:tab w:val="left" w:pos="900"/>
@@ -3530,7 +3572,7 @@
         <w:pStyle w:val="ListParagraph"/>
         <w:numPr>
           <w:ilvl w:val="0"/>
-          <w:numId w:val="49"/>
+          <w:numId w:val="50"/>
         </w:numPr>
         <w:tabs>
           <w:tab w:val="left" w:pos="900"/>
@@ -16097,6 +16139,158 @@
     </w:lvl>
   </w:abstractNum>
   <w:abstractNum w:abstractNumId="42" w15:restartNumberingAfterBreak="0">
+    <w:nsid w:val="65761DAE"/>
+    <w:multiLevelType w:val="multilevel"/>
+    <w:tmpl w:val="A8B4B226"/>
+    <w:lvl w:ilvl="0">
+      <w:start w:val="1"/>
+      <w:numFmt w:val="decimal"/>
+      <w:lvlText w:val="%1."/>
+      <w:lvlJc w:val="left"/>
+      <w:pPr>
+        <w:tabs>
+          <w:tab w:val="num" w:pos="720"/>
+        </w:tabs>
+        <w:ind w:left="720" w:hanging="360"/>
+      </w:pPr>
+      <w:rPr>
+        <w:rFonts w:ascii="ITC Zapf Chancery" w:hAnsi="ITC Zapf Chancery" w:hint="default"/>
+        <w:sz w:val="24"/>
+      </w:rPr>
+    </w:lvl>
+    <w:lvl w:ilvl="1">
+      <w:start w:val="1"/>
+      <w:numFmt w:val="lowerLetter"/>
+      <w:lvlText w:val="%2."/>
+      <w:lvlJc w:val="left"/>
+      <w:pPr>
+        <w:tabs>
+          <w:tab w:val="num" w:pos="1440"/>
+        </w:tabs>
+        <w:ind w:left="1440" w:hanging="360"/>
+      </w:pPr>
+      <w:rPr>
+        <w:rFonts w:ascii="ITC Zapf Chancery" w:hAnsi="ITC Zapf Chancery" w:hint="default"/>
+        <w:sz w:val="24"/>
+      </w:rPr>
+    </w:lvl>
+    <w:lvl w:ilvl="2">
+      <w:start w:val="1"/>
+      <w:numFmt w:val="lowerRoman"/>
+      <w:lvlText w:val="%3."/>
+      <w:lvlJc w:val="left"/>
+      <w:pPr>
+        <w:tabs>
+          <w:tab w:val="num" w:pos="2160"/>
+        </w:tabs>
+        <w:ind w:left="2160" w:hanging="360"/>
+      </w:pPr>
+      <w:rPr>
+        <w:rFonts w:ascii="ITC Zapf Chancery" w:hAnsi="ITC Zapf Chancery" w:hint="default"/>
+        <w:sz w:val="24"/>
+      </w:rPr>
+    </w:lvl>
+    <w:lvl w:ilvl="3">
+      <w:start w:val="1"/>
+      <w:numFmt w:val="bullet"/>
+      <w:lvlText w:val=""/>
+      <w:lvlJc w:val="left"/>
+      <w:pPr>
+        <w:tabs>
+          <w:tab w:val="num" w:pos="2880"/>
+        </w:tabs>
+        <w:ind w:left="2880" w:hanging="360"/>
+      </w:pPr>
+      <w:rPr>
+        <w:rFonts w:ascii="Symbol" w:hAnsi="Symbol" w:hint="default"/>
+        <w:color w:val="auto"/>
+        <w:sz w:val="24"/>
+      </w:rPr>
+    </w:lvl>
+    <w:lvl w:ilvl="4">
+      <w:start w:val="1"/>
+      <w:numFmt w:val="bullet"/>
+      <w:lvlText w:val="o"/>
+      <w:lvlJc w:val="left"/>
+      <w:pPr>
+        <w:tabs>
+          <w:tab w:val="num" w:pos="3600"/>
+        </w:tabs>
+        <w:ind w:left="3600" w:hanging="360"/>
+      </w:pPr>
+      <w:rPr>
+        <w:rFonts w:ascii="Courier New" w:hAnsi="Courier New" w:hint="default"/>
+        <w:sz w:val="24"/>
+      </w:rPr>
+    </w:lvl>
+    <w:lvl w:ilvl="5">
+      <w:start w:val="1"/>
+      <w:numFmt w:val="bullet"/>
+      <w:lvlText w:val=""/>
+      <w:lvlJc w:val="left"/>
+      <w:pPr>
+        <w:tabs>
+          <w:tab w:val="num" w:pos="4320"/>
+        </w:tabs>
+        <w:ind w:left="4320" w:hanging="360"/>
+      </w:pPr>
+      <w:rPr>
+        <w:rFonts w:ascii="Wingdings" w:hAnsi="Wingdings" w:hint="default"/>
+        <w:sz w:val="20"/>
+      </w:rPr>
+    </w:lvl>
+    <w:lvl w:ilvl="6">
+      <w:start w:val="1"/>
+      <w:numFmt w:val="bullet"/>
+      <w:lvlText w:val=""/>
+      <w:lvlJc w:val="left"/>
+      <w:pPr>
+        <w:tabs>
+          <w:tab w:val="num" w:pos="5040"/>
+        </w:tabs>
+        <w:ind w:left="5040" w:hanging="360"/>
+      </w:pPr>
+      <w:rPr>
+        <w:rFonts w:ascii="Symbol" w:hAnsi="Symbol" w:hint="default"/>
+        <w:color w:val="auto"/>
+        <w:sz w:val="20"/>
+      </w:rPr>
+    </w:lvl>
+    <w:lvl w:ilvl="7">
+      <w:start w:val="1"/>
+      <w:numFmt w:val="bullet"/>
+      <w:lvlText w:val=""/>
+      <w:lvlJc w:val="left"/>
+      <w:pPr>
+        <w:tabs>
+          <w:tab w:val="num" w:pos="5760"/>
+        </w:tabs>
+        <w:ind w:left="5760" w:hanging="360"/>
+      </w:pPr>
+      <w:rPr>
+        <w:rFonts w:ascii="Symbol" w:hAnsi="Symbol" w:hint="default"/>
+        <w:color w:val="auto"/>
+        <w:sz w:val="20"/>
+      </w:rPr>
+    </w:lvl>
+    <w:lvl w:ilvl="8">
+      <w:start w:val="1"/>
+      <w:numFmt w:val="bullet"/>
+      <w:lvlText w:val="o"/>
+      <w:lvlJc w:val="left"/>
+      <w:pPr>
+        <w:tabs>
+          <w:tab w:val="num" w:pos="6480"/>
+        </w:tabs>
+        <w:ind w:left="6480" w:hanging="360"/>
+      </w:pPr>
+      <w:rPr>
+        <w:rFonts w:ascii="Courier New" w:hAnsi="Courier New" w:hint="default"/>
+        <w:sz w:val="20"/>
+      </w:rPr>
+    </w:lvl>
+  </w:abstractNum>
+  <w:abstractNum w:abstractNumId="43" w15:restartNumberingAfterBreak="0">
     <w:nsid w:val="668C61DB"/>
     <w:multiLevelType w:val="hybridMultilevel"/>
     <w:tmpl w:val="B784C200"/>
@@ -16209,7 +16403,7 @@
       </w:rPr>
     </w:lvl>
   </w:abstractNum>
-  <w:abstractNum w:abstractNumId="43" w15:restartNumberingAfterBreak="0">
+  <w:abstractNum w:abstractNumId="44" w15:restartNumberingAfterBreak="0">
     <w:nsid w:val="6A7547F0"/>
     <w:multiLevelType w:val="hybridMultilevel"/>
     <w:tmpl w:val="1C46EA38"/>
@@ -16322,7 +16516,7 @@
       </w:rPr>
     </w:lvl>
   </w:abstractNum>
-  <w:abstractNum w:abstractNumId="44" w15:restartNumberingAfterBreak="0">
+  <w:abstractNum w:abstractNumId="45" w15:restartNumberingAfterBreak="0">
     <w:nsid w:val="6B6B23BD"/>
     <w:multiLevelType w:val="hybridMultilevel"/>
     <w:tmpl w:val="6128AA98"/>
@@ -16435,7 +16629,7 @@
       </w:rPr>
     </w:lvl>
   </w:abstractNum>
-  <w:abstractNum w:abstractNumId="45" w15:restartNumberingAfterBreak="0">
+  <w:abstractNum w:abstractNumId="46" w15:restartNumberingAfterBreak="0">
     <w:nsid w:val="6DB20C25"/>
     <w:multiLevelType w:val="multilevel"/>
     <w:tmpl w:val="475C178C"/>
@@ -16584,7 +16778,7 @@
       </w:rPr>
     </w:lvl>
   </w:abstractNum>
-  <w:abstractNum w:abstractNumId="46" w15:restartNumberingAfterBreak="0">
+  <w:abstractNum w:abstractNumId="47" w15:restartNumberingAfterBreak="0">
     <w:nsid w:val="6EE337E4"/>
     <w:multiLevelType w:val="hybridMultilevel"/>
     <w:tmpl w:val="B60091CE"/>
@@ -16697,7 +16891,7 @@
       </w:rPr>
     </w:lvl>
   </w:abstractNum>
-  <w:abstractNum w:abstractNumId="47" w15:restartNumberingAfterBreak="0">
+  <w:abstractNum w:abstractNumId="48" w15:restartNumberingAfterBreak="0">
     <w:nsid w:val="76C661EA"/>
     <w:multiLevelType w:val="multilevel"/>
     <w:tmpl w:val="4C468DFE"/>
@@ -16810,7 +17004,7 @@
       </w:pPr>
     </w:lvl>
   </w:abstractNum>
-  <w:abstractNum w:abstractNumId="48" w15:restartNumberingAfterBreak="0">
+  <w:abstractNum w:abstractNumId="49" w15:restartNumberingAfterBreak="0">
     <w:nsid w:val="7F622E0E"/>
     <w:multiLevelType w:val="hybridMultilevel"/>
     <w:tmpl w:val="7C043B26"/>
@@ -16924,7 +17118,7 @@
     </w:lvl>
   </w:abstractNum>
   <w:num w:numId="1" w16cid:durableId="1367365675">
-    <w:abstractNumId w:val="42"/>
+    <w:abstractNumId w:val="43"/>
   </w:num>
   <w:num w:numId="2" w16cid:durableId="1841114582">
     <w:abstractNumId w:val="8"/>
@@ -16936,13 +17130,13 @@
     <w:abstractNumId w:val="4"/>
   </w:num>
   <w:num w:numId="5" w16cid:durableId="1730030353">
-    <w:abstractNumId w:val="46"/>
+    <w:abstractNumId w:val="47"/>
   </w:num>
   <w:num w:numId="6" w16cid:durableId="194660171">
     <w:abstractNumId w:val="27"/>
   </w:num>
   <w:num w:numId="7" w16cid:durableId="24647283">
-    <w:abstractNumId w:val="43"/>
+    <w:abstractNumId w:val="44"/>
   </w:num>
   <w:num w:numId="8" w16cid:durableId="1809323015">
     <w:abstractNumId w:val="17"/>
@@ -16951,13 +17145,13 @@
     <w:abstractNumId w:val="6"/>
   </w:num>
   <w:num w:numId="10" w16cid:durableId="862938908">
-    <w:abstractNumId w:val="48"/>
+    <w:abstractNumId w:val="49"/>
   </w:num>
   <w:num w:numId="11" w16cid:durableId="1479610516">
     <w:abstractNumId w:val="26"/>
   </w:num>
   <w:num w:numId="12" w16cid:durableId="789593544">
-    <w:abstractNumId w:val="44"/>
+    <w:abstractNumId w:val="45"/>
   </w:num>
   <w:num w:numId="13" w16cid:durableId="222376419">
     <w:abstractNumId w:val="14"/>
@@ -16966,7 +17160,7 @@
     <w:abstractNumId w:val="0"/>
   </w:num>
   <w:num w:numId="15" w16cid:durableId="1580090319">
-    <w:abstractNumId w:val="47"/>
+    <w:abstractNumId w:val="48"/>
   </w:num>
   <w:num w:numId="16" w16cid:durableId="182323638">
     <w:abstractNumId w:val="25"/>
@@ -16984,7 +17178,7 @@
     <w:abstractNumId w:val="7"/>
   </w:num>
   <w:num w:numId="21" w16cid:durableId="1704283978">
-    <w:abstractNumId w:val="45"/>
+    <w:abstractNumId w:val="46"/>
   </w:num>
   <w:num w:numId="22" w16cid:durableId="885332400">
     <w:abstractNumId w:val="22"/>
@@ -17069,6 +17263,9 @@
   </w:num>
   <w:num w:numId="49" w16cid:durableId="1017774617">
     <w:abstractNumId w:val="32"/>
+  </w:num>
+  <w:num w:numId="50" w16cid:durableId="1921793086">
+    <w:abstractNumId w:val="42"/>
   </w:num>
 </w:numbering>
 </file>
@@ -17679,6 +17876,7 @@
   <w:style w:type="character" w:default="1" w:styleId="DefaultParagraphFont">
     <w:name w:val="Default Paragraph Font"/>
     <w:uiPriority w:val="1"/>
+    <w:semiHidden/>
     <w:unhideWhenUsed/>
   </w:style>
   <w:style w:type="table" w:default="1" w:styleId="TableNormal">

</xml_diff>